<commit_message>
Sync resume docx and certifications
</commit_message>
<xml_diff>
--- a/assets/resume/Jaani_Francis_Nickolas_Resume.docx
+++ b/assets/resume/Jaani_Francis_Nickolas_Resume.docx
@@ -2310,6 +2310,24 @@
           <w:lang w:val="en-US"/>
         </w:rPr>
         <w:t xml:space="preserve">HashiCorp Certified Terraform Associate </w:t>
+      </w:r>
+      <w:r>
+        <w:rPr>
+          <w:rFonts w:ascii="Calibri Light" w:cs="Calibri Light" w:hAnsi="Calibri Light" w:eastAsia="Calibri Light"/>
+          <w:sz w:val="20"/>
+          <w:szCs w:val="20"/>
+        </w:rPr>
+        <w:br w:type="textWrapping"/>
+      </w:r>
+      <w:r>
+        <w:rPr>
+          <w:rFonts w:ascii="Calibri Light" w:hAnsi="Calibri Light"/>
+          <w:sz w:val="20"/>
+          <w:szCs w:val="20"/>
+          <w:rtl w:val="0"/>
+          <w:lang w:val="en-US"/>
+        </w:rPr>
+        <w:t>Lean Six Sigma Yellow Belt</w:t>
       </w:r>
       <w:r>
         <w:rPr>

</xml_diff>

<commit_message>
Add AWS AIF certification
</commit_message>
<xml_diff>
--- a/assets/resume/Jaani_Francis_Nickolas_Resume.docx
+++ b/assets/resume/Jaani_Francis_Nickolas_Resume.docx
@@ -502,7 +502,27 @@
             </w14:solidFill>
           </w14:textFill>
         </w:rPr>
-        <w:t>Jul 2024 - Present</w:t>
+        <w:t xml:space="preserve">Jul 2024 - </w:t>
+      </w:r>
+      <w:r>
+        <w:rPr>
+          <w:rFonts w:ascii="Carlito" w:hAnsi="Carlito"/>
+          <w:b w:val="1"/>
+          <w:bCs w:val="1"/>
+          <w:outline w:val="0"/>
+          <w:color w:val="2f5496"/>
+          <w:sz w:val="20"/>
+          <w:szCs w:val="20"/>
+          <w:u w:color="2f5496"/>
+          <w:rtl w:val="0"/>
+          <w:lang w:val="en-US"/>
+          <w14:textFill>
+            <w14:solidFill>
+              <w14:srgbClr w14:val="2F5496"/>
+            </w14:solidFill>
+          </w14:textFill>
+        </w:rPr>
+        <w:t>Jul 2026</w:t>
       </w:r>
     </w:p>
     <w:p>
@@ -2301,6 +2321,56 @@
         <w:spacing w:before="40" w:after="0" w:line="240" w:lineRule="auto"/>
         <w:jc w:val="both"/>
       </w:pPr>
+      <w:r>
+        <w:rPr>
+          <w:rFonts w:ascii="Calibri Light" w:hAnsi="Calibri Light"/>
+          <w:sz w:val="20"/>
+          <w:szCs w:val="20"/>
+          <w:rtl w:val="0"/>
+          <w:lang w:val="en-US"/>
+        </w:rPr>
+        <w:t>A</w:t>
+      </w:r>
+      <w:r>
+        <w:rPr>
+          <w:rFonts w:ascii="Calibri Light" w:hAnsi="Calibri Light"/>
+          <w:sz w:val="20"/>
+          <w:szCs w:val="20"/>
+          <w:rtl w:val="0"/>
+          <w:lang w:val="en-US"/>
+        </w:rPr>
+        <w:t xml:space="preserve">WS Certified </w:t>
+      </w:r>
+      <w:r>
+        <w:rPr>
+          <w:rFonts w:ascii="Calibri Light" w:hAnsi="Calibri Light"/>
+          <w:sz w:val="20"/>
+          <w:szCs w:val="20"/>
+          <w:rtl w:val="0"/>
+          <w:lang w:val="en-US"/>
+        </w:rPr>
+        <w:t>AI</w:t>
+      </w:r>
+      <w:r>
+        <w:rPr>
+          <w:rFonts w:ascii="Calibri Light" w:hAnsi="Calibri Light"/>
+          <w:sz w:val="20"/>
+          <w:szCs w:val="20"/>
+          <w:rtl w:val="0"/>
+          <w:lang w:val="en-US"/>
+        </w:rPr>
+        <w:t xml:space="preserve"> Practitioner</w:t>
+      </w:r>
+      <w:r>
+        <w:rPr>
+          <w:rFonts w:ascii="Carlito" w:cs="Carlito" w:hAnsi="Carlito" w:eastAsia="Carlito"/>
+          <w:b w:val="1"/>
+          <w:bCs w:val="1"/>
+          <w:sz w:val="22"/>
+          <w:szCs w:val="22"/>
+        </w:rPr>
+        <w:br w:type="textWrapping"/>
+      </w:r>
       <w:r>
         <w:rPr>
           <w:rFonts w:ascii="Calibri Light" w:hAnsi="Calibri Light"/>

</xml_diff>

<commit_message>
Sync resume and certification workflow
</commit_message>
<xml_diff>
--- a/assets/resume/Jaani_Francis_Nickolas_Resume.docx
+++ b/assets/resume/Jaani_Francis_Nickolas_Resume.docx
@@ -185,7 +185,7 @@
           <w:rtl w:val="0"/>
           <w:lang w:val="en-US"/>
         </w:rPr>
-        <w:t>Technical Product Owner | Multi-Cloud Platforms | Infrastructure Engineering | Internal Developer Platforms</w:t>
+        <w:t>Product Owner | Multi-Cloud Platforms | Infrastructure Engineering | Internal Developer Platforms</w:t>
       </w:r>
     </w:p>
     <w:p>
@@ -215,7 +215,7 @@
           <w:rtl w:val="0"/>
           <w:lang w:val="en-US"/>
         </w:rPr>
-        <w:t xml:space="preserve">Technical Product Owner with 10+ years of experience in </w:t>
+        <w:t xml:space="preserve">Product Owner with 10+ years of experience in </w:t>
       </w:r>
       <w:r>
         <w:rPr>
@@ -2330,37 +2330,36 @@
           <w:rtl w:val="0"/>
           <w:lang w:val="en-US"/>
         </w:rPr>
-        <w:t>A</w:t>
-      </w:r>
-      <w:r>
-        <w:rPr>
-          <w:rFonts w:ascii="Calibri Light" w:hAnsi="Calibri Light"/>
-          <w:sz w:val="20"/>
-          <w:szCs w:val="20"/>
-          <w:rtl w:val="0"/>
-          <w:lang w:val="en-US"/>
-        </w:rPr>
-        <w:t xml:space="preserve">WS Certified </w:t>
-      </w:r>
-      <w:r>
-        <w:rPr>
-          <w:rFonts w:ascii="Calibri Light" w:hAnsi="Calibri Light"/>
-          <w:sz w:val="20"/>
-          <w:szCs w:val="20"/>
-          <w:rtl w:val="0"/>
-          <w:lang w:val="en-US"/>
-        </w:rPr>
-        <w:t>AI</w:t>
-      </w:r>
-      <w:r>
-        <w:rPr>
-          <w:rFonts w:ascii="Calibri Light" w:hAnsi="Calibri Light"/>
-          <w:sz w:val="20"/>
-          <w:szCs w:val="20"/>
-          <w:rtl w:val="0"/>
-          <w:lang w:val="en-US"/>
-        </w:rPr>
-        <w:t xml:space="preserve"> Practitioner</w:t>
+        <w:t xml:space="preserve">Scrum.org certified - </w:t>
+      </w:r>
+      <w:r>
+        <w:rPr>
+          <w:rFonts w:ascii="Calibri Light" w:hAnsi="Calibri Light"/>
+          <w:sz w:val="20"/>
+          <w:szCs w:val="20"/>
+          <w:rtl w:val="0"/>
+          <w:lang w:val="en-US"/>
+        </w:rPr>
+        <w:t>Professional Scrum Product Owner</w:t>
+      </w:r>
+      <w:r>
+        <w:rPr>
+          <w:rFonts w:ascii="Calibri Light" w:hAnsi="Calibri Light" w:hint="default"/>
+          <w:sz w:val="20"/>
+          <w:szCs w:val="20"/>
+          <w:rtl w:val="0"/>
+        </w:rPr>
+        <w:t xml:space="preserve">™ </w:t>
+      </w:r>
+      <w:r>
+        <w:rPr>
+          <w:rFonts w:ascii="Calibri Light" w:hAnsi="Calibri Light"/>
+          <w:sz w:val="20"/>
+          <w:szCs w:val="20"/>
+          <w:rtl w:val="0"/>
+          <w:lang w:val="pt-PT"/>
+        </w:rPr>
+        <w:t>II (PSPO II)</w:t>
       </w:r>
       <w:r>
         <w:rPr>
@@ -2380,7 +2379,127 @@
           <w:rtl w:val="0"/>
           <w:lang w:val="en-US"/>
         </w:rPr>
-        <w:t xml:space="preserve">HashiCorp Certified Terraform Associate </w:t>
+        <w:t>A</w:t>
+      </w:r>
+      <w:r>
+        <w:rPr>
+          <w:rFonts w:ascii="Calibri Light" w:hAnsi="Calibri Light"/>
+          <w:sz w:val="20"/>
+          <w:szCs w:val="20"/>
+          <w:rtl w:val="0"/>
+          <w:lang w:val="en-US"/>
+        </w:rPr>
+        <w:t xml:space="preserve">WS Certified </w:t>
+      </w:r>
+      <w:r>
+        <w:rPr>
+          <w:rFonts w:ascii="Calibri Light" w:hAnsi="Calibri Light"/>
+          <w:sz w:val="20"/>
+          <w:szCs w:val="20"/>
+          <w:rtl w:val="0"/>
+          <w:lang w:val="en-US"/>
+        </w:rPr>
+        <w:t xml:space="preserve">- </w:t>
+      </w:r>
+      <w:r>
+        <w:rPr>
+          <w:rFonts w:ascii="Calibri Light" w:hAnsi="Calibri Light"/>
+          <w:sz w:val="20"/>
+          <w:szCs w:val="20"/>
+          <w:rtl w:val="0"/>
+          <w:lang w:val="en-US"/>
+        </w:rPr>
+        <w:t>Cloud Practitioner</w:t>
+      </w:r>
+      <w:r>
+        <w:rPr>
+          <w:rFonts w:ascii="Carlito" w:cs="Carlito" w:hAnsi="Carlito" w:eastAsia="Carlito"/>
+          <w:b w:val="1"/>
+          <w:bCs w:val="1"/>
+          <w:sz w:val="22"/>
+          <w:szCs w:val="22"/>
+        </w:rPr>
+        <w:br w:type="textWrapping"/>
+      </w:r>
+      <w:r>
+        <w:rPr>
+          <w:rFonts w:ascii="Calibri Light" w:hAnsi="Calibri Light"/>
+          <w:sz w:val="20"/>
+          <w:szCs w:val="20"/>
+          <w:rtl w:val="0"/>
+          <w:lang w:val="en-US"/>
+        </w:rPr>
+        <w:t>A</w:t>
+      </w:r>
+      <w:r>
+        <w:rPr>
+          <w:rFonts w:ascii="Calibri Light" w:hAnsi="Calibri Light"/>
+          <w:sz w:val="20"/>
+          <w:szCs w:val="20"/>
+          <w:rtl w:val="0"/>
+          <w:lang w:val="en-US"/>
+        </w:rPr>
+        <w:t xml:space="preserve">WS Certified </w:t>
+      </w:r>
+      <w:r>
+        <w:rPr>
+          <w:rFonts w:ascii="Calibri Light" w:hAnsi="Calibri Light"/>
+          <w:sz w:val="20"/>
+          <w:szCs w:val="20"/>
+          <w:rtl w:val="0"/>
+          <w:lang w:val="en-US"/>
+        </w:rPr>
+        <w:t>- AI</w:t>
+      </w:r>
+      <w:r>
+        <w:rPr>
+          <w:rFonts w:ascii="Calibri Light" w:hAnsi="Calibri Light"/>
+          <w:sz w:val="20"/>
+          <w:szCs w:val="20"/>
+          <w:rtl w:val="0"/>
+          <w:lang w:val="en-US"/>
+        </w:rPr>
+        <w:t xml:space="preserve"> Practitioner</w:t>
+      </w:r>
+      <w:r>
+        <w:rPr>
+          <w:rFonts w:ascii="Carlito" w:cs="Carlito" w:hAnsi="Carlito" w:eastAsia="Carlito"/>
+          <w:b w:val="1"/>
+          <w:bCs w:val="1"/>
+          <w:sz w:val="22"/>
+          <w:szCs w:val="22"/>
+        </w:rPr>
+        <w:br w:type="textWrapping"/>
+      </w:r>
+      <w:r>
+        <w:rPr>
+          <w:rFonts w:ascii="Calibri Light" w:hAnsi="Calibri Light"/>
+          <w:sz w:val="20"/>
+          <w:szCs w:val="20"/>
+          <w:rtl w:val="0"/>
+          <w:lang w:val="en-US"/>
+        </w:rPr>
+        <w:t xml:space="preserve">HashiCorp Certified </w:t>
+      </w:r>
+      <w:r>
+        <w:rPr>
+          <w:rFonts w:ascii="Calibri Light" w:hAnsi="Calibri Light"/>
+          <w:sz w:val="20"/>
+          <w:szCs w:val="20"/>
+          <w:rtl w:val="0"/>
+          <w:lang w:val="en-US"/>
+        </w:rPr>
+        <w:t xml:space="preserve">- </w:t>
+      </w:r>
+      <w:r>
+        <w:rPr>
+          <w:rFonts w:ascii="Calibri Light" w:hAnsi="Calibri Light"/>
+          <w:sz w:val="20"/>
+          <w:szCs w:val="20"/>
+          <w:rtl w:val="0"/>
+          <w:lang w:val="it-IT"/>
+        </w:rPr>
+        <w:t xml:space="preserve">Terraform Associate </w:t>
       </w:r>
       <w:r>
         <w:rPr>
@@ -2398,35 +2517,17 @@
           <w:rtl w:val="0"/>
           <w:lang w:val="en-US"/>
         </w:rPr>
+        <w:t xml:space="preserve">Lean 6 Certified - </w:t>
+      </w:r>
+      <w:r>
+        <w:rPr>
+          <w:rFonts w:ascii="Calibri Light" w:hAnsi="Calibri Light"/>
+          <w:sz w:val="20"/>
+          <w:szCs w:val="20"/>
+          <w:rtl w:val="0"/>
+          <w:lang w:val="en-US"/>
+        </w:rPr>
         <w:t>Lean Six Sigma Yellow Belt</w:t>
-      </w:r>
-      <w:r>
-        <w:rPr>
-          <w:rFonts w:ascii="Calibri Light" w:cs="Calibri Light" w:hAnsi="Calibri Light" w:eastAsia="Calibri Light"/>
-          <w:sz w:val="20"/>
-          <w:szCs w:val="20"/>
-        </w:rPr>
-        <w:br w:type="textWrapping"/>
-      </w:r>
-      <w:r>
-        <w:rPr>
-          <w:rFonts w:ascii="Calibri Light" w:hAnsi="Calibri Light"/>
-          <w:sz w:val="20"/>
-          <w:szCs w:val="20"/>
-          <w:rtl w:val="0"/>
-          <w:lang w:val="en-US"/>
-        </w:rPr>
-        <w:t>A</w:t>
-      </w:r>
-      <w:r>
-        <w:rPr>
-          <w:rFonts w:ascii="Calibri Light" w:hAnsi="Calibri Light"/>
-          <w:sz w:val="20"/>
-          <w:szCs w:val="20"/>
-          <w:rtl w:val="0"/>
-          <w:lang w:val="en-US"/>
-        </w:rPr>
-        <w:t>WS Certified Cloud Practitioner</w:t>
       </w:r>
     </w:p>
     <w:sectPr>

</xml_diff>